<commit_message>
One-page report: rarity pass rewrite, facts unchanged
Co-Authored-By: Claude Opus 5.5 <noreply@anthropic.com>
</commit_message>
<xml_diff>
--- a/Project-Report-OnePager.docx
+++ b/Project-Report-OnePager.docx
@@ -45,7 +45,7 @@
           <w:sz w:val="22"/>
           <w:szCs w:val="22"/>
         </w:rPr>
-        <w:t xml:space="preserve">The question</w:t>
+        <w:t xml:space="preserve">What we set out to answer</w:t>
       </w:r>
     </w:p>
     <w:p>
@@ -53,7 +53,7 @@
         <w:spacing w:after="70" w:line="252"/>
       </w:pPr>
       <w:r>
-        <w:t xml:space="preserve">Companies now let AI agents do real work, such as preparing supplier payments, and put a person in the loop to approve it. We asked how that human check should be designed, because a reviewer who clicks Approve without looking adds nothing. Our example: an AI is about to pay a supplier ₹3,40,000 when a fake email from a lookalike domain asks for the money to go to a new bank account, today.</w:t>
+        <w:t xml:space="preserve">More and more, companies let AI agents do real work, like preparing supplier payments, and keep a person in the loop to sign it off. The query we posed was how that human check ought to be designed. If the reviewer just clicks Approve without opening anything, there's really no point having a person there at all. Our test case: an AI is about to pay a supplier ₹3,40,000 when an email from a lookalike domain turns up, asking for the money to go to a new bank account. Today.</w:t>
       </w:r>
     </w:p>
     <w:p>
@@ -79,7 +79,7 @@
         <w:spacing w:after="70" w:line="252"/>
       </w:pPr>
       <w:r>
-        <w:t xml:space="preserve">A web tool where a manager makes six oversight choices: when the AI must stop, who reviews and who covers for them, what evidence the reviewer sees, what powers they have, what makes an approval count, and what happens when things go wrong. The tool turns those choices into a rulebook for the AI (a SKILL.md file), then runs the fraud case through four stages while a live map shows where the design held or failed.</w:t>
+        <w:t xml:space="preserve">A web tool in which a manager makes six oversight choices: when the AI has to stop, who reviews and who covers for them, what evidence the reviewer gets to see, what they're allowed to do, what makes an approval count, and what happens when something goes wrong. The tool turns those choices into a rulebook for the AI (a SKILL.md file). It then walks the fraud case through four stages, and a live map shows where the design held and where it gave way.</w:t>
       </w:r>
     </w:p>
     <w:p>
@@ -87,7 +87,7 @@
         <w:spacing w:after="70" w:line="252"/>
       </w:pPr>
       <w:r>
-        <w:t xml:space="preserve">The AI is Claude Haiku 5.5. Jev, a decision model from TypeSafe, scores three risks: do the documents conflict, is someone pushing to skip checks, and has the change been verified. A Telegram bot can send the approval to a real phone, and a phone approval is refused unless the reviewer opened the evidence first. API keys stay on the server and are not in the code.</w:t>
+        <w:t xml:space="preserve">The AI is Claude Haiku 5.5. Jev, a decision model from TypeSafe, weighs three risks: do the documents contradict each other, is someone pushing to skip a check, and has the change been verified. A Telegram bot can send the approval to an actual phone, though a phone approval is refused unless the reviewer opened the evidence first. API keys sit on the server, never in the code.</w:t>
       </w:r>
     </w:p>
     <w:p>
@@ -120,7 +120,7 @@
         <w:t xml:space="preserve">A rulebook advises; code enforces.</w:t>
       </w:r>
       <w:r>
-        <w:t xml:space="preserve"> Under a typical first design the AI paused correctly, the reviewer approved in one click, and the money went to the fraudster. Under a strong design the same case was blocked, because code kept Approve locked until someone called the supplier on the number in the company's own records. The people and the AI were the same both times.</w:t>
+        <w:t xml:space="preserve"> Under a typical first design the AI paused, as it should, and the reviewer approved in a single click. The fraudster got paid. Under a strong design the same case was blocked, because the code kept Approve locked until someone rang the supplier on the number in the company's own records. Same people, same AI. Only the design changed.</w:t>
       </w:r>
     </w:p>
     <w:p>
@@ -128,7 +128,7 @@
         <w:spacing w:after="70" w:line="252"/>
       </w:pPr>
       <w:r>
-        <w:t xml:space="preserve">We then tested the rulebook on 11 cases, with answers fixed in advance, across three AI versions and three tries each (99 answers). Six cases looked risky but were safe, to catch an AI that blocks everything.</w:t>
+        <w:t xml:space="preserve">Then we put the rulebook itself to the test: 11 cases, correct answers fixed in advance, three versions of the AI and three tries each, 99 answers in total. Six of the cases looked risky but were actually safe, so an AI that simply blocks everything would show up straight away.</w:t>
       </w:r>
     </w:p>
     <w:tbl>
@@ -434,7 +434,7 @@
         <w:spacing w:after="70" w:line="252"/>
       </w:pPr>
       <w:r>
-        <w:t xml:space="preserve">The AI handled obvious cases without help. The rulebook mattered where an exception was easy to miss: on a properly recorded domain change, the AI without it blocked a safe payment every time, and with it let the payment through every time. Testing also exposed our own mistakes. Our first rulebook was too strict, and one test case left out facts the AI needed. We fixed both. The remaining error traced to an ambiguous rule in our made-up policy, which no rulebook can fix.</w:t>
+        <w:t xml:space="preserve">On obvious cases the AI coped fine without help. The rulebook earned its place where an exception was easy to miss. On a properly recorded change of email domain, the AI without it blocked a safe payment every time; with it, the payment went through every time. Testing caught our own slips too. Our first rulebook was too strict, and one test case left out facts the AI needed, so we fixed both. The one error left traced back to an ambiguous rule in our made-up payment policy, and no rulebook can fix that.</w:t>
       </w:r>
     </w:p>
     <w:p>
@@ -460,7 +460,7 @@
         <w:spacing w:after="70" w:line="252"/>
       </w:pPr>
       <w:r>
-        <w:t xml:space="preserve">Eleven cases and one model show a direction, not an error rate. The policy and data are invented, briefing scores rely on keywords, and code can only check that a process was followed. A reviewer who has been fooled can still approve.</w:t>
+        <w:t xml:space="preserve">Eleven cases and a single model are enough to show a direction, and too few for an error rate. The policy and data are invented, and the briefing scores lean on keywords. Code, for its part, can only check that a process was followed. A reviewer who has been properly fooled can still approve.</w:t>
       </w:r>
     </w:p>
     <w:p>
@@ -486,7 +486,7 @@
         <w:spacing w:after="70" w:line="252"/>
       </w:pPr>
       <w:r>
-        <w:t xml:space="preserve">Make the six oversight choices deliberately. Put the controls that must never fail, such as independent verification, separation of duties and cancelling approvals when details change, into the software. Use rulebooks for judgment at the edges and test them, counting false alarms as well as missed fraud. If a policy can be read two ways, fix the policy first.</w:t>
+        <w:t xml:space="preserve">Make the six oversight choices on purpose. The controls that must never fail, such as independent verification, separation of duties and cancelling an approval when details change, belong in the software. Use rulebooks for judgment at the edges and test them, counting false alarms as well as missed fraud. And if a policy can be read two ways, sort out the policy first.</w:t>
       </w:r>
     </w:p>
     <w:sectPr>

</xml_diff>